<commit_message>
docs: apply 2026-06-14 editorial cleanup findings
</commit_message>
<xml_diff>
--- a/WordPress-Transients-Persistent-Object-Cache-Reference.docx
+++ b/WordPress-Transients-Persistent-Object-Cache-Reference.docx
@@ -6448,27 +6448,6 @@
           <w:rStyle w:val="VerbatimChar"/>
         </w:rPr>
         <w:t xml:space="preserve">docs/source-corrections.md</w:t>
-      </w:r>
-    </w:p>
-    <w:p>
-      <w:pPr>
-        <w:pStyle w:val="Compact"/>
-        <w:numPr>
-          <w:ilvl w:val="0"/>
-          <w:numId w:val="1021"/>
-        </w:numPr>
-      </w:pPr>
-      <w:r>
-        <w:t xml:space="preserve">Editorial review round:</w:t>
-      </w:r>
-      <w:r>
-        <w:t xml:space="preserve"> </w:t>
-      </w:r>
-      <w:r>
-        <w:rPr>
-          <w:rStyle w:val="VerbatimChar"/>
-        </w:rPr>
-        <w:t xml:space="preserve">reviews/rounds/2026-05-18/</w:t>
       </w:r>
     </w:p>
     <w:bookmarkEnd w:id="77"/>

</xml_diff>